<commit_message>
added some info and graphics of acceleration
</commit_message>
<xml_diff>
--- a/lab-4/lab-4.docx
+++ b/lab-4/lab-4.docx
@@ -197,11 +197,34 @@
           <w:sz w:val="32"/>
           <w:szCs w:val="32"/>
         </w:rPr>
-        <w:t>Преподаватель: Мичуров Михаил Антонович</w:t>
-      </w:r>
-    </w:p>
-    <w:p>
-      <w:r>
+        <w:t xml:space="preserve">Преподаватель: </w:t>
+      </w:r>
+      <w:proofErr w:type="spellStart"/>
+      <w:r>
+        <w:rPr>
+          <w:b/>
+          <w:bCs/>
+          <w:sz w:val="32"/>
+          <w:szCs w:val="32"/>
+        </w:rPr>
+        <w:t>Мичуров</w:t>
+      </w:r>
+      <w:proofErr w:type="spellEnd"/>
+      <w:r>
+        <w:rPr>
+          <w:b/>
+          <w:bCs/>
+          <w:sz w:val="32"/>
+          <w:szCs w:val="32"/>
+        </w:rPr>
+        <w:t xml:space="preserve"> Михаил Антонович</w:t>
+      </w:r>
+    </w:p>
+    <w:p>
+      <w:r>
+        <w:rPr>
+          <w:noProof/>
+        </w:rPr>
         <w:lastRenderedPageBreak/>
         <w:drawing>
           <wp:inline distT="0" distB="0" distL="0" distR="0" wp14:anchorId="35EBCF5E" wp14:editId="7A0125FC">
@@ -242,41 +265,28 @@
     </w:p>
     <w:p/>
     <w:p/>
-    <w:p/>
-    <w:p/>
-    <w:p>
-      <w:pPr>
-        <w:rPr>
-          <w:b/>
-          <w:bCs/>
-          <w:sz w:val="32"/>
-          <w:szCs w:val="32"/>
-        </w:rPr>
-      </w:pPr>
-      <w:r>
-        <w:rPr>
-          <w:b/>
-          <w:bCs/>
-          <w:sz w:val="32"/>
-          <w:szCs w:val="32"/>
-        </w:rPr>
-        <w:t>Ниже приведены графики, получившиеся в результате работы программы:</w:t>
-      </w:r>
-      <w:r>
-        <w:rPr>
-          <w:b/>
-          <w:bCs/>
-          <w:sz w:val="32"/>
-          <w:szCs w:val="32"/>
-        </w:rPr>
-        <w:br/>
-      </w:r>
+    <w:p>
+      <w:pPr>
+        <w:rPr>
+          <w:sz w:val="28"/>
+          <w:szCs w:val="28"/>
+        </w:rPr>
+      </w:pPr>
+      <w:r>
+        <w:rPr>
+          <w:sz w:val="28"/>
+          <w:szCs w:val="28"/>
+        </w:rPr>
+        <w:t>Задача была решена методом декомпозиции на «линейке»</w:t>
+      </w:r>
+    </w:p>
+    <w:p>
       <w:r>
         <w:drawing>
-          <wp:inline distT="0" distB="0" distL="0" distR="0" wp14:anchorId="5FC3F206" wp14:editId="5CD33DB7">
-            <wp:extent cx="6377203" cy="3047151"/>
-            <wp:effectExtent l="0" t="0" r="5080" b="1270"/>
-            <wp:docPr id="2" name="Рисунок 2"/>
+          <wp:inline distT="0" distB="0" distL="0" distR="0" wp14:anchorId="0C0C5DB9" wp14:editId="7E5FD3FE">
+            <wp:extent cx="2347943" cy="2701818"/>
+            <wp:effectExtent l="0" t="0" r="0" b="3810"/>
+            <wp:docPr id="7" name="Рисунок 7"/>
             <wp:cNvGraphicFramePr>
               <a:graphicFrameLocks xmlns:a="http://schemas.openxmlformats.org/drawingml/2006/main" noChangeAspect="1"/>
             </wp:cNvGraphicFramePr>
@@ -296,7 +306,7 @@
                   <pic:spPr>
                     <a:xfrm>
                       <a:off x="0" y="0"/>
-                      <a:ext cx="6392895" cy="3054649"/>
+                      <a:ext cx="2368968" cy="2726012"/>
                     </a:xfrm>
                     <a:prstGeom prst="rect">
                       <a:avLst/>
@@ -316,24 +326,15 @@
     <w:p/>
     <w:p/>
     <w:p/>
-    <w:p>
-      <w:pPr>
-        <w:rPr>
-          <w:b/>
-          <w:bCs/>
-          <w:sz w:val="32"/>
-          <w:szCs w:val="32"/>
-        </w:rPr>
-      </w:pPr>
-    </w:p>
-    <w:p>
-      <w:pPr>
-        <w:rPr>
-          <w:b/>
-          <w:bCs/>
-          <w:sz w:val="32"/>
-          <w:szCs w:val="32"/>
-          <w:lang w:val="en-US"/>
+    <w:p/>
+    <w:p/>
+    <w:p>
+      <w:pPr>
+        <w:rPr>
+          <w:b/>
+          <w:bCs/>
+          <w:sz w:val="32"/>
+          <w:szCs w:val="32"/>
         </w:rPr>
       </w:pPr>
       <w:r>
@@ -344,26 +345,26 @@
           <w:szCs w:val="32"/>
         </w:rPr>
         <w:lastRenderedPageBreak/>
-        <w:t xml:space="preserve">График из программы </w:t>
-      </w:r>
-      <w:r>
-        <w:rPr>
-          <w:b/>
-          <w:bCs/>
-          <w:sz w:val="32"/>
-          <w:szCs w:val="32"/>
-          <w:lang w:val="en-US"/>
-        </w:rPr>
-        <w:t>Jupmshot:</w:t>
-      </w:r>
-    </w:p>
-    <w:p>
-      <w:r>
+        <w:t>Ниже приведены графики, получившиеся в результате работы программы:</w:t>
+      </w:r>
+      <w:r>
+        <w:rPr>
+          <w:b/>
+          <w:bCs/>
+          <w:sz w:val="32"/>
+          <w:szCs w:val="32"/>
+        </w:rPr>
+        <w:br/>
+      </w:r>
+      <w:r>
+        <w:rPr>
+          <w:noProof/>
+        </w:rPr>
         <w:drawing>
-          <wp:inline distT="0" distB="0" distL="0" distR="0" wp14:anchorId="470C3551" wp14:editId="3312B773">
-            <wp:extent cx="5940425" cy="2610485"/>
-            <wp:effectExtent l="0" t="0" r="3175" b="0"/>
-            <wp:docPr id="3" name="Рисунок 3"/>
+          <wp:inline distT="0" distB="0" distL="0" distR="0" wp14:anchorId="5FC3F206" wp14:editId="4097C816">
+            <wp:extent cx="6395437" cy="3055865"/>
+            <wp:effectExtent l="0" t="0" r="5715" b="0"/>
+            <wp:docPr id="2" name="Рисунок 2"/>
             <wp:cNvGraphicFramePr>
               <a:graphicFrameLocks xmlns:a="http://schemas.openxmlformats.org/drawingml/2006/main" noChangeAspect="1"/>
             </wp:cNvGraphicFramePr>
@@ -383,7 +384,7 @@
                   <pic:spPr>
                     <a:xfrm>
                       <a:off x="0" y="0"/>
-                      <a:ext cx="5940425" cy="2610485"/>
+                      <a:ext cx="6438191" cy="3076294"/>
                     </a:xfrm>
                     <a:prstGeom prst="rect">
                       <a:avLst/>
@@ -396,14 +397,21 @@
         </w:drawing>
       </w:r>
     </w:p>
-    <w:p/>
-    <w:p>
-      <w:r>
+    <w:p>
+      <w:pPr>
+        <w:rPr>
+          <w:lang w:val="en-US"/>
+        </w:rPr>
+      </w:pPr>
+      <w:r>
+        <w:rPr>
+          <w:lang w:val="en-US"/>
+        </w:rPr>
         <w:drawing>
-          <wp:inline distT="0" distB="0" distL="0" distR="0" wp14:anchorId="75A9B19E" wp14:editId="23D6C73A">
-            <wp:extent cx="5940425" cy="2592070"/>
-            <wp:effectExtent l="0" t="0" r="3175" b="0"/>
-            <wp:docPr id="4" name="Рисунок 4"/>
+          <wp:inline distT="0" distB="0" distL="0" distR="0" wp14:anchorId="1D1F5ECA" wp14:editId="66888FDD">
+            <wp:extent cx="6408405" cy="3374431"/>
+            <wp:effectExtent l="0" t="0" r="0" b="0"/>
+            <wp:docPr id="5" name="Рисунок 5"/>
             <wp:cNvGraphicFramePr>
               <a:graphicFrameLocks xmlns:a="http://schemas.openxmlformats.org/drawingml/2006/main" noChangeAspect="1"/>
             </wp:cNvGraphicFramePr>
@@ -423,6 +431,193 @@
                   <pic:spPr>
                     <a:xfrm>
                       <a:off x="0" y="0"/>
+                      <a:ext cx="6420218" cy="3380651"/>
+                    </a:xfrm>
+                    <a:prstGeom prst="rect">
+                      <a:avLst/>
+                    </a:prstGeom>
+                  </pic:spPr>
+                </pic:pic>
+              </a:graphicData>
+            </a:graphic>
+          </wp:inline>
+        </w:drawing>
+      </w:r>
+    </w:p>
+    <w:p>
+      <w:r>
+        <w:lastRenderedPageBreak/>
+        <w:drawing>
+          <wp:inline distT="0" distB="0" distL="0" distR="0" wp14:anchorId="4F21D7C0" wp14:editId="4774F211">
+            <wp:extent cx="6382886" cy="3285941"/>
+            <wp:effectExtent l="0" t="0" r="0" b="0"/>
+            <wp:docPr id="6" name="Рисунок 6"/>
+            <wp:cNvGraphicFramePr>
+              <a:graphicFrameLocks xmlns:a="http://schemas.openxmlformats.org/drawingml/2006/main" noChangeAspect="1"/>
+            </wp:cNvGraphicFramePr>
+            <a:graphic xmlns:a="http://schemas.openxmlformats.org/drawingml/2006/main">
+              <a:graphicData uri="http://schemas.openxmlformats.org/drawingml/2006/picture">
+                <pic:pic xmlns:pic="http://schemas.openxmlformats.org/drawingml/2006/picture">
+                  <pic:nvPicPr>
+                    <pic:cNvPr id="1" name=""/>
+                    <pic:cNvPicPr/>
+                  </pic:nvPicPr>
+                  <pic:blipFill>
+                    <a:blip r:embed="rId8"/>
+                    <a:stretch>
+                      <a:fillRect/>
+                    </a:stretch>
+                  </pic:blipFill>
+                  <pic:spPr>
+                    <a:xfrm>
+                      <a:off x="0" y="0"/>
+                      <a:ext cx="6399411" cy="3294448"/>
+                    </a:xfrm>
+                    <a:prstGeom prst="rect">
+                      <a:avLst/>
+                    </a:prstGeom>
+                  </pic:spPr>
+                </pic:pic>
+              </a:graphicData>
+            </a:graphic>
+          </wp:inline>
+        </w:drawing>
+      </w:r>
+    </w:p>
+    <w:p/>
+    <w:p>
+      <w:pPr>
+        <w:rPr>
+          <w:b/>
+          <w:bCs/>
+          <w:sz w:val="32"/>
+          <w:szCs w:val="32"/>
+          <w:lang w:val="en-US"/>
+        </w:rPr>
+      </w:pPr>
+      <w:r>
+        <w:rPr>
+          <w:b/>
+          <w:bCs/>
+          <w:sz w:val="32"/>
+          <w:szCs w:val="32"/>
+        </w:rPr>
+        <w:t>График</w:t>
+      </w:r>
+      <w:r>
+        <w:rPr>
+          <w:b/>
+          <w:bCs/>
+          <w:sz w:val="32"/>
+          <w:szCs w:val="32"/>
+        </w:rPr>
+        <w:t>и</w:t>
+      </w:r>
+      <w:r>
+        <w:rPr>
+          <w:b/>
+          <w:bCs/>
+          <w:sz w:val="32"/>
+          <w:szCs w:val="32"/>
+        </w:rPr>
+        <w:t xml:space="preserve"> из программы </w:t>
+      </w:r>
+      <w:proofErr w:type="spellStart"/>
+      <w:r>
+        <w:rPr>
+          <w:b/>
+          <w:bCs/>
+          <w:sz w:val="32"/>
+          <w:szCs w:val="32"/>
+          <w:lang w:val="en-US"/>
+        </w:rPr>
+        <w:t>Jupmshot</w:t>
+      </w:r>
+      <w:proofErr w:type="spellEnd"/>
+      <w:r>
+        <w:rPr>
+          <w:b/>
+          <w:bCs/>
+          <w:sz w:val="32"/>
+          <w:szCs w:val="32"/>
+          <w:lang w:val="en-US"/>
+        </w:rPr>
+        <w:t>:</w:t>
+      </w:r>
+    </w:p>
+    <w:p>
+      <w:r>
+        <w:rPr>
+          <w:noProof/>
+        </w:rPr>
+        <w:drawing>
+          <wp:inline distT="0" distB="0" distL="0" distR="0" wp14:anchorId="470C3551" wp14:editId="3312B773">
+            <wp:extent cx="5940425" cy="2610485"/>
+            <wp:effectExtent l="0" t="0" r="3175" b="0"/>
+            <wp:docPr id="3" name="Рисунок 3"/>
+            <wp:cNvGraphicFramePr>
+              <a:graphicFrameLocks xmlns:a="http://schemas.openxmlformats.org/drawingml/2006/main" noChangeAspect="1"/>
+            </wp:cNvGraphicFramePr>
+            <a:graphic xmlns:a="http://schemas.openxmlformats.org/drawingml/2006/main">
+              <a:graphicData uri="http://schemas.openxmlformats.org/drawingml/2006/picture">
+                <pic:pic xmlns:pic="http://schemas.openxmlformats.org/drawingml/2006/picture">
+                  <pic:nvPicPr>
+                    <pic:cNvPr id="1" name=""/>
+                    <pic:cNvPicPr/>
+                  </pic:nvPicPr>
+                  <pic:blipFill>
+                    <a:blip r:embed="rId9"/>
+                    <a:stretch>
+                      <a:fillRect/>
+                    </a:stretch>
+                  </pic:blipFill>
+                  <pic:spPr>
+                    <a:xfrm>
+                      <a:off x="0" y="0"/>
+                      <a:ext cx="5940425" cy="2610485"/>
+                    </a:xfrm>
+                    <a:prstGeom prst="rect">
+                      <a:avLst/>
+                    </a:prstGeom>
+                  </pic:spPr>
+                </pic:pic>
+              </a:graphicData>
+            </a:graphic>
+          </wp:inline>
+        </w:drawing>
+      </w:r>
+    </w:p>
+    <w:p/>
+    <w:p>
+      <w:r>
+        <w:rPr>
+          <w:noProof/>
+        </w:rPr>
+        <w:lastRenderedPageBreak/>
+        <w:drawing>
+          <wp:inline distT="0" distB="0" distL="0" distR="0" wp14:anchorId="75A9B19E" wp14:editId="23D6C73A">
+            <wp:extent cx="5940425" cy="2592070"/>
+            <wp:effectExtent l="0" t="0" r="3175" b="0"/>
+            <wp:docPr id="4" name="Рисунок 4"/>
+            <wp:cNvGraphicFramePr>
+              <a:graphicFrameLocks xmlns:a="http://schemas.openxmlformats.org/drawingml/2006/main" noChangeAspect="1"/>
+            </wp:cNvGraphicFramePr>
+            <a:graphic xmlns:a="http://schemas.openxmlformats.org/drawingml/2006/main">
+              <a:graphicData uri="http://schemas.openxmlformats.org/drawingml/2006/picture">
+                <pic:pic xmlns:pic="http://schemas.openxmlformats.org/drawingml/2006/picture">
+                  <pic:nvPicPr>
+                    <pic:cNvPr id="1" name=""/>
+                    <pic:cNvPicPr/>
+                  </pic:nvPicPr>
+                  <pic:blipFill>
+                    <a:blip r:embed="rId10"/>
+                    <a:stretch>
+                      <a:fillRect/>
+                    </a:stretch>
+                  </pic:blipFill>
+                  <pic:spPr>
+                    <a:xfrm>
+                      <a:off x="0" y="0"/>
                       <a:ext cx="5940425" cy="2592070"/>
                     </a:xfrm>
                     <a:prstGeom prst="rect">
@@ -447,31 +642,39 @@
     <w:p/>
     <w:p/>
     <w:p/>
-    <w:p>
-      <w:pPr>
-        <w:rPr>
-          <w:sz w:val="32"/>
-          <w:szCs w:val="32"/>
-          <w:lang w:val="en-US"/>
-        </w:rPr>
-      </w:pPr>
-      <w:r>
-        <w:rPr>
-          <w:sz w:val="32"/>
-          <w:szCs w:val="32"/>
-        </w:rPr>
-        <w:lastRenderedPageBreak/>
-        <w:t xml:space="preserve">Репозиторий с </w:t>
-      </w:r>
-      <w:r>
-        <w:rPr>
-          <w:sz w:val="32"/>
-          <w:szCs w:val="32"/>
-        </w:rPr>
-        <w:t>проекта</w:t>
-      </w:r>
+    <w:p/>
+    <w:p/>
+    <w:p/>
+    <w:p>
       <w:bookmarkStart w:id="0" w:name="_GoBack"/>
       <w:bookmarkEnd w:id="0"/>
+    </w:p>
+    <w:p/>
+    <w:p/>
+    <w:p/>
+    <w:p/>
+    <w:p/>
+    <w:p>
+      <w:pPr>
+        <w:rPr>
+          <w:sz w:val="32"/>
+          <w:szCs w:val="32"/>
+        </w:rPr>
+      </w:pPr>
+      <w:r>
+        <w:rPr>
+          <w:sz w:val="32"/>
+          <w:szCs w:val="32"/>
+        </w:rPr>
+        <w:t xml:space="preserve">Репозиторий с </w:t>
+      </w:r>
+      <w:r>
+        <w:rPr>
+          <w:sz w:val="32"/>
+          <w:szCs w:val="32"/>
+        </w:rPr>
+        <w:t>проекта</w:t>
+      </w:r>
       <w:r>
         <w:rPr>
           <w:sz w:val="32"/>
@@ -486,10 +689,9 @@
           <w:rStyle w:val="a3"/>
           <w:sz w:val="28"/>
           <w:szCs w:val="28"/>
-          <w:lang w:val="en-US"/>
-        </w:rPr>
-      </w:pPr>
-      <w:hyperlink r:id="rId8" w:history="1">
+        </w:rPr>
+      </w:pPr>
+      <w:hyperlink r:id="rId11" w:history="1">
         <w:r>
           <w:rPr>
             <w:rStyle w:val="a3"/>
@@ -497,7 +699,178 @@
             <w:szCs w:val="28"/>
             <w:lang w:val="en-US"/>
           </w:rPr>
-          <w:t>https://github.com/DrySparrow/24205-obmetko-opp-cpp/tree/lab-4/lab-4</w:t>
+          <w:t>https</w:t>
+        </w:r>
+        <w:r>
+          <w:rPr>
+            <w:rStyle w:val="a3"/>
+            <w:sz w:val="28"/>
+            <w:szCs w:val="28"/>
+          </w:rPr>
+          <w:t>://</w:t>
+        </w:r>
+        <w:proofErr w:type="spellStart"/>
+        <w:r>
+          <w:rPr>
+            <w:rStyle w:val="a3"/>
+            <w:sz w:val="28"/>
+            <w:szCs w:val="28"/>
+            <w:lang w:val="en-US"/>
+          </w:rPr>
+          <w:t>github</w:t>
+        </w:r>
+        <w:proofErr w:type="spellEnd"/>
+        <w:r>
+          <w:rPr>
+            <w:rStyle w:val="a3"/>
+            <w:sz w:val="28"/>
+            <w:szCs w:val="28"/>
+          </w:rPr>
+          <w:t>.</w:t>
+        </w:r>
+        <w:r>
+          <w:rPr>
+            <w:rStyle w:val="a3"/>
+            <w:sz w:val="28"/>
+            <w:szCs w:val="28"/>
+            <w:lang w:val="en-US"/>
+          </w:rPr>
+          <w:t>com</w:t>
+        </w:r>
+        <w:r>
+          <w:rPr>
+            <w:rStyle w:val="a3"/>
+            <w:sz w:val="28"/>
+            <w:szCs w:val="28"/>
+          </w:rPr>
+          <w:t>/</w:t>
+        </w:r>
+        <w:proofErr w:type="spellStart"/>
+        <w:r>
+          <w:rPr>
+            <w:rStyle w:val="a3"/>
+            <w:sz w:val="28"/>
+            <w:szCs w:val="28"/>
+            <w:lang w:val="en-US"/>
+          </w:rPr>
+          <w:t>DrySparrow</w:t>
+        </w:r>
+        <w:proofErr w:type="spellEnd"/>
+        <w:r>
+          <w:rPr>
+            <w:rStyle w:val="a3"/>
+            <w:sz w:val="28"/>
+            <w:szCs w:val="28"/>
+          </w:rPr>
+          <w:t>/24205-</w:t>
+        </w:r>
+        <w:proofErr w:type="spellStart"/>
+        <w:r>
+          <w:rPr>
+            <w:rStyle w:val="a3"/>
+            <w:sz w:val="28"/>
+            <w:szCs w:val="28"/>
+            <w:lang w:val="en-US"/>
+          </w:rPr>
+          <w:t>obmetko</w:t>
+        </w:r>
+        <w:proofErr w:type="spellEnd"/>
+        <w:r>
+          <w:rPr>
+            <w:rStyle w:val="a3"/>
+            <w:sz w:val="28"/>
+            <w:szCs w:val="28"/>
+          </w:rPr>
+          <w:t>-</w:t>
+        </w:r>
+        <w:proofErr w:type="spellStart"/>
+        <w:r>
+          <w:rPr>
+            <w:rStyle w:val="a3"/>
+            <w:sz w:val="28"/>
+            <w:szCs w:val="28"/>
+            <w:lang w:val="en-US"/>
+          </w:rPr>
+          <w:t>opp</w:t>
+        </w:r>
+        <w:proofErr w:type="spellEnd"/>
+        <w:r>
+          <w:rPr>
+            <w:rStyle w:val="a3"/>
+            <w:sz w:val="28"/>
+            <w:szCs w:val="28"/>
+          </w:rPr>
+          <w:t>-</w:t>
+        </w:r>
+        <w:proofErr w:type="spellStart"/>
+        <w:r>
+          <w:rPr>
+            <w:rStyle w:val="a3"/>
+            <w:sz w:val="28"/>
+            <w:szCs w:val="28"/>
+            <w:lang w:val="en-US"/>
+          </w:rPr>
+          <w:t>cpp</w:t>
+        </w:r>
+        <w:proofErr w:type="spellEnd"/>
+        <w:r>
+          <w:rPr>
+            <w:rStyle w:val="a3"/>
+            <w:sz w:val="28"/>
+            <w:szCs w:val="28"/>
+          </w:rPr>
+          <w:t>/</w:t>
+        </w:r>
+        <w:r>
+          <w:rPr>
+            <w:rStyle w:val="a3"/>
+            <w:sz w:val="28"/>
+            <w:szCs w:val="28"/>
+            <w:lang w:val="en-US"/>
+          </w:rPr>
+          <w:t>tree</w:t>
+        </w:r>
+        <w:r>
+          <w:rPr>
+            <w:rStyle w:val="a3"/>
+            <w:sz w:val="28"/>
+            <w:szCs w:val="28"/>
+          </w:rPr>
+          <w:t>/</w:t>
+        </w:r>
+        <w:r>
+          <w:rPr>
+            <w:rStyle w:val="a3"/>
+            <w:sz w:val="28"/>
+            <w:szCs w:val="28"/>
+            <w:lang w:val="en-US"/>
+          </w:rPr>
+          <w:t>lab</w:t>
+        </w:r>
+        <w:r>
+          <w:rPr>
+            <w:rStyle w:val="a3"/>
+            <w:sz w:val="28"/>
+            <w:szCs w:val="28"/>
+          </w:rPr>
+          <w:t>-4/</w:t>
+        </w:r>
+        <w:r>
+          <w:rPr>
+            <w:rStyle w:val="a3"/>
+            <w:sz w:val="28"/>
+            <w:szCs w:val="28"/>
+            <w:lang w:val="en-US"/>
+          </w:rPr>
+          <w:t>lab</w:t>
+        </w:r>
+        <w:r>
+          <w:rPr>
+            <w:rStyle w:val="a3"/>
+            <w:sz w:val="28"/>
+            <w:szCs w:val="28"/>
+          </w:rPr>
+          <w:t>-4</w:t>
         </w:r>
       </w:hyperlink>
     </w:p>
@@ -507,7 +880,6 @@
           <w:rStyle w:val="a3"/>
           <w:sz w:val="28"/>
           <w:szCs w:val="28"/>
-          <w:lang w:val="en-US"/>
         </w:rPr>
       </w:pPr>
     </w:p>
@@ -516,17 +888,10 @@
         <w:rPr>
           <w:sz w:val="28"/>
           <w:szCs w:val="28"/>
-          <w:lang w:val="en-US"/>
-        </w:rPr>
-      </w:pPr>
-    </w:p>
-    <w:p>
-      <w:pPr>
-        <w:rPr>
-          <w:lang w:val="en-US"/>
-        </w:rPr>
-      </w:pPr>
-    </w:p>
+        </w:rPr>
+      </w:pPr>
+    </w:p>
+    <w:p/>
     <w:sectPr>
       <w:pgSz w:w="11906" w:h="16838"/>
       <w:pgMar w:top="1134" w:right="850" w:bottom="1134" w:left="1701" w:header="708" w:footer="708" w:gutter="0"/>

</xml_diff>